<commit_message>
Refine submission document styling
</commit_message>
<xml_diff>
--- a/docs/Inleverdocument_Trendbrein_Hugo_Halfmouw.docx
+++ b/docs/Inleverdocument_Trendbrein_Hugo_Halfmouw.docx
@@ -5,29 +5,31 @@
     <w:p>
       <w:pPr>
         <w:pStyle w:val="Title"/>
-        <w:spacing w:after="60"/>
+        <w:spacing w:after="20"/>
         <w:jc w:val="left"/>
       </w:pPr>
       <w:r>
         <w:rPr>
-          <w:rFonts w:ascii="Aptos" w:hAnsi="Aptos"/>
+          <w:rFonts w:ascii="Liberation Sans" w:hAnsi="Liberation Sans"/>
           <w:b/>
+          <w:i w:val="0"/>
           <w:color w:val="000000"/>
-          <w:sz w:val="50"/>
+          <w:sz w:val="42"/>
         </w:rPr>
         <w:t>Trendbrein</w:t>
       </w:r>
     </w:p>
     <w:p>
       <w:pPr>
-        <w:spacing w:after="40"/>
+        <w:spacing w:after="20"/>
       </w:pPr>
       <w:r>
         <w:rPr>
-          <w:rFonts w:ascii="Aptos" w:hAnsi="Aptos"/>
-          <w:b/>
-          <w:color w:val="2E4037"/>
-          <w:sz w:val="26"/>
+          <w:rFonts w:ascii="Liberation Sans" w:hAnsi="Liberation Sans"/>
+          <w:b w:val="0"/>
+          <w:i w:val="0"/>
+          <w:color w:val="52595E"/>
+          <w:sz w:val="21"/>
         </w:rPr>
         <w:t>Trends - Onderneem! De Ontdekkingsreis</w:t>
       </w:r>
@@ -38,53 +40,58 @@
       </w:pPr>
       <w:r>
         <w:rPr>
-          <w:rFonts w:ascii="Aptos" w:hAnsi="Aptos"/>
-          <w:color w:val="525D63"/>
-          <w:sz w:val="22"/>
+          <w:rFonts w:ascii="Liberation Sans" w:hAnsi="Liberation Sans"/>
+          <w:b w:val="0"/>
+          <w:i w:val="0"/>
+          <w:color w:val="52595E"/>
+          <w:sz w:val="21"/>
         </w:rPr>
         <w:t>Hugo Halfmouw</w:t>
       </w:r>
     </w:p>
     <w:p>
       <w:pPr>
-        <w:spacing w:after="120" w:line="283" w:lineRule="auto"/>
+        <w:spacing w:after="140" w:line="293" w:lineRule="auto"/>
       </w:pPr>
       <w:r>
         <w:rPr>
-          <w:rFonts w:ascii="Aptos" w:hAnsi="Aptos"/>
-          <w:color w:val="1E252A"/>
+          <w:rFonts w:ascii="Liberation Sans" w:hAnsi="Liberation Sans"/>
+          <w:b w:val="0"/>
+          <w:i w:val="0"/>
+          <w:color w:val="1C2023"/>
           <w:sz w:val="21"/>
         </w:rPr>
-        <w:t>Voor deze opdracht heb ik tijdens de trendweken signalen verzameld uit nieuws, producten, sociale media en mijn eigen omgeving. In plaats van een traditioneel verslag heb ik mijn analyse verwerkt in een interactief Trendbrein. Daarin laat ik zien hoe ik van losse signalen naar patronen, trends, waardeverschuivingen en mogelijke kansrichtingen ben gegaan.</w:t>
+        <w:t>Tijdens de trendweken heb ik signalen verzameld uit nieuws, producten, sociale media en mijn eigen omgeving. In plaats van een traditioneel verslag heb ik mijn analyse uitgewerkt in een interactief Trendbrein. Daarin laat ik zien hoe ik van losse signalen naar patronen, trends, waardeverschuivingen en mogelijke kansrichtingen ben gegaan.</w:t>
       </w:r>
     </w:p>
     <w:p>
       <w:pPr>
-        <w:spacing w:before="240" w:after="80"/>
+        <w:spacing w:before="200" w:after="60"/>
       </w:pPr>
       <w:r>
         <w:rPr>
-          <w:rFonts w:ascii="Aptos" w:hAnsi="Aptos"/>
+          <w:rFonts w:ascii="Liberation Sans" w:hAnsi="Liberation Sans"/>
           <w:b/>
+          <w:i w:val="0"/>
           <w:color w:val="000000"/>
-          <w:sz w:val="25"/>
+          <w:sz w:val="23"/>
         </w:rPr>
         <w:t>Website</w:t>
       </w:r>
     </w:p>
     <w:p>
       <w:pPr>
-        <w:spacing w:after="60"/>
+        <w:spacing w:after="80"/>
       </w:pPr>
       <w:r>
         <w:rPr>
-          <w:rFonts w:ascii="Aptos" w:hAnsi="Aptos"/>
+          <w:rFonts w:ascii="Liberation Sans" w:hAnsi="Liberation Sans"/>
           <w:b/>
-          <w:color w:val="1E252A"/>
+          <w:i w:val="0"/>
+          <w:color w:val="1C2023"/>
           <w:sz w:val="21"/>
         </w:rPr>
-        <w:t>Interactieve uitwerking</w:t>
-        <w:br/>
+        <w:t xml:space="preserve">Interactieve uitwerking: </w:t>
       </w:r>
       <w:hyperlink r:id="rId9">
         <w:r>
@@ -103,13 +110,13 @@
       </w:pPr>
       <w:r>
         <w:rPr>
-          <w:rFonts w:ascii="Aptos" w:hAnsi="Aptos"/>
-          <w:b/>
-          <w:color w:val="525D63"/>
+          <w:rFonts w:ascii="Liberation Sans" w:hAnsi="Liberation Sans"/>
+          <w:b w:val="0"/>
+          <w:i w:val="0"/>
+          <w:color w:val="52595E"/>
           <w:sz w:val="19"/>
         </w:rPr>
-        <w:t>Project en broncode</w:t>
-        <w:br/>
+        <w:t xml:space="preserve">Project en broncode: </w:t>
       </w:r>
       <w:hyperlink r:id="rId10">
         <w:r>
@@ -124,146 +131,82 @@
     </w:p>
     <w:p>
       <w:pPr>
-        <w:spacing w:before="240" w:after="80"/>
+        <w:spacing w:before="200" w:after="60"/>
       </w:pPr>
       <w:r>
         <w:rPr>
-          <w:rFonts w:ascii="Aptos" w:hAnsi="Aptos"/>
+          <w:rFonts w:ascii="Liberation Sans" w:hAnsi="Liberation Sans"/>
           <w:b/>
+          <w:i w:val="0"/>
           <w:color w:val="000000"/>
-          <w:sz w:val="25"/>
+          <w:sz w:val="23"/>
         </w:rPr>
-        <w:t>Aanbevolen route</w:t>
+        <w:t>Aanbevolen manier van bekijken</w:t>
       </w:r>
     </w:p>
     <w:p>
       <w:pPr>
-        <w:spacing w:after="120" w:line="283" w:lineRule="auto"/>
+        <w:spacing w:after="140" w:line="293" w:lineRule="auto"/>
       </w:pPr>
       <w:r>
         <w:rPr>
-          <w:rFonts w:ascii="Aptos" w:hAnsi="Aptos"/>
-          <w:color w:val="1E252A"/>
+          <w:rFonts w:ascii="Liberation Sans" w:hAnsi="Liberation Sans"/>
+          <w:b w:val="0"/>
+          <w:i w:val="0"/>
+          <w:color w:val="1C2023"/>
           <w:sz w:val="21"/>
         </w:rPr>
-        <w:t>De website kan vrij worden verkend, maar voor de beoordeling raad ik aan om eerst op 'Volg mijn reis' te klikken. Deze route vertelt mijn onderzoek in de volgorde waarin het is ontstaan. Je kunt tussendoor doorklikken naar signalen, bronnen en andere nodes; de tour onthoudt je voortgang.</w:t>
+        <w:t>Je kunt de website vrij verkennen, maar voor de beoordeling raad ik aan om eerst op 'Volg mijn reis' te klikken. Die route vertelt mijn onderzoek in de volgorde waarin het is ontstaan. Je kunt onderweg doorklikken naar signalen, bronnen en andere nodes; de tour onthoudt je voortgang.</w:t>
       </w:r>
     </w:p>
     <w:p>
       <w:pPr>
-        <w:spacing w:before="240" w:after="80"/>
+        <w:spacing w:before="200" w:after="60"/>
       </w:pPr>
       <w:r>
         <w:rPr>
-          <w:rFonts w:ascii="Aptos" w:hAnsi="Aptos"/>
+          <w:rFonts w:ascii="Liberation Sans" w:hAnsi="Liberation Sans"/>
           <w:b/>
+          <w:i w:val="0"/>
           <w:color w:val="000000"/>
-          <w:sz w:val="25"/>
+          <w:sz w:val="23"/>
         </w:rPr>
-        <w:t>Wat is er te vinden</w:t>
+        <w:t>Wat je in de website vindt</w:t>
       </w:r>
     </w:p>
     <w:p>
       <w:pPr>
-        <w:spacing w:after="20" w:line="264" w:lineRule="auto"/>
-        <w:ind w:left="259" w:hanging="202"/>
+        <w:spacing w:after="200" w:line="293" w:lineRule="auto"/>
       </w:pPr>
       <w:r>
         <w:rPr>
-          <w:rFonts w:ascii="Aptos" w:hAnsi="Aptos"/>
-          <w:color w:val="1E252A"/>
-          <w:sz w:val="20"/>
+          <w:rFonts w:ascii="Liberation Sans" w:hAnsi="Liberation Sans"/>
+          <w:b w:val="0"/>
+          <w:i w:val="0"/>
+          <w:color w:val="1C2023"/>
+          <w:sz w:val="21"/>
         </w:rPr>
-        <w:t>• mijn signalen en observaties;</w:t>
+        <w:t>Je vindt er mijn signalen en observaties, clustering en trendduiding, analyse met de modellen uit de lessen, waardeverschuivingen, scenario's, mijn reflectie en rode draad, en de ideation met uiteindelijke kansrichtingen.</w:t>
       </w:r>
     </w:p>
     <w:p>
       <w:pPr>
-        <w:spacing w:after="20" w:line="264" w:lineRule="auto"/>
-        <w:ind w:left="259" w:hanging="202"/>
+        <w:spacing w:before="60" w:line="283" w:lineRule="auto"/>
       </w:pPr>
       <w:r>
         <w:rPr>
-          <w:rFonts w:ascii="Aptos" w:hAnsi="Aptos"/>
-          <w:color w:val="1E252A"/>
+          <w:rFonts w:ascii="Liberation Sans" w:hAnsi="Liberation Sans"/>
+          <w:b w:val="0"/>
+          <w:i/>
+          <w:color w:val="52595E"/>
           <w:sz w:val="20"/>
         </w:rPr>
-        <w:t>• clustering en trendduiding;</w:t>
-      </w:r>
-    </w:p>
-    <w:p>
-      <w:pPr>
-        <w:spacing w:after="20" w:line="264" w:lineRule="auto"/>
-        <w:ind w:left="259" w:hanging="202"/>
-      </w:pPr>
-      <w:r>
-        <w:rPr>
-          <w:rFonts w:ascii="Aptos" w:hAnsi="Aptos"/>
-          <w:color w:val="1E252A"/>
-          <w:sz w:val="20"/>
-        </w:rPr>
-        <w:t>• analyse met de modellen uit de lessen;</w:t>
-      </w:r>
-    </w:p>
-    <w:p>
-      <w:pPr>
-        <w:spacing w:after="20" w:line="264" w:lineRule="auto"/>
-        <w:ind w:left="259" w:hanging="202"/>
-      </w:pPr>
-      <w:r>
-        <w:rPr>
-          <w:rFonts w:ascii="Aptos" w:hAnsi="Aptos"/>
-          <w:color w:val="1E252A"/>
-          <w:sz w:val="20"/>
-        </w:rPr>
-        <w:t>• waardeverschuivingen en scenario's;</w:t>
-      </w:r>
-    </w:p>
-    <w:p>
-      <w:pPr>
-        <w:spacing w:after="20" w:line="264" w:lineRule="auto"/>
-        <w:ind w:left="259" w:hanging="202"/>
-      </w:pPr>
-      <w:r>
-        <w:rPr>
-          <w:rFonts w:ascii="Aptos" w:hAnsi="Aptos"/>
-          <w:color w:val="1E252A"/>
-          <w:sz w:val="20"/>
-        </w:rPr>
-        <w:t>• mijn eigen reflectie en rode draad;</w:t>
-      </w:r>
-    </w:p>
-    <w:p>
-      <w:pPr>
-        <w:spacing w:after="20" w:line="264" w:lineRule="auto"/>
-        <w:ind w:left="259" w:hanging="202"/>
-      </w:pPr>
-      <w:r>
-        <w:rPr>
-          <w:rFonts w:ascii="Aptos" w:hAnsi="Aptos"/>
-          <w:color w:val="1E252A"/>
-          <w:sz w:val="20"/>
-        </w:rPr>
-        <w:t>• ideation en uiteindelijke kansrichtingen.</w:t>
-      </w:r>
-    </w:p>
-    <w:p>
-      <w:pPr>
-        <w:spacing w:before="260" w:after="0" w:line="276" w:lineRule="auto"/>
-      </w:pPr>
-      <w:r>
-        <w:rPr>
-          <w:rFonts w:ascii="Aptos" w:hAnsi="Aptos"/>
-          <w:i/>
-          <w:color w:val="525D63"/>
-          <w:sz w:val="20"/>
-        </w:rPr>
-        <w:t>De website vormt mijn daadwerkelijke uitwerking; dit document is alleen een korte ingang voor de beoordeling.</w:t>
+        <w:t>De website is mijn daadwerkelijke uitwerking; dit document is alleen een korte ingang voor de beoordeling.</w:t>
       </w:r>
     </w:p>
     <w:sectPr>
       <w:pgSz w:w="12240" w:h="15840"/>
-      <w:pgMar w:top="1123" w:right="1238" w:bottom="1037" w:left="1238" w:header="720" w:footer="720" w:gutter="0"/>
+      <w:pgMar w:top="1296" w:right="1368" w:bottom="1224" w:left="1368" w:header="720" w:footer="720" w:gutter="0"/>
       <w:cols w:space="720"/>
       <w:docGrid w:linePitch="360"/>
     </w:sectPr>
@@ -635,7 +578,7 @@
     <w:qFormat/>
     <w:rsid w:val="00FC693F"/>
     <w:rPr>
-      <w:rFonts w:ascii="Aptos" w:hAnsi="Aptos"/>
+      <w:rFonts w:ascii="Liberation Sans" w:hAnsi="Liberation Sans"/>
       <w:sz w:val="21"/>
     </w:rPr>
   </w:style>
@@ -984,12 +927,12 @@
       <w:contextualSpacing/>
     </w:pPr>
     <w:rPr>
-      <w:rFonts w:asciiTheme="majorHAnsi" w:eastAsiaTheme="majorEastAsia" w:hAnsiTheme="majorHAnsi" w:cstheme="majorBidi" w:ascii="Aptos Display" w:hAnsi="Aptos Display"/>
+      <w:rFonts w:asciiTheme="majorHAnsi" w:eastAsiaTheme="majorEastAsia" w:hAnsiTheme="majorHAnsi" w:cstheme="majorBidi" w:ascii="Liberation Sans" w:hAnsi="Liberation Sans"/>
       <w:b/>
       <w:color w:val="000000"/>
       <w:spacing w:val="5"/>
       <w:kern w:val="28"/>
-      <w:sz w:val="50"/>
+      <w:sz w:val="42"/>
       <w:szCs w:val="52"/>
     </w:rPr>
   </w:style>

</xml_diff>

<commit_message>
Add simple technical website explanation
</commit_message>
<xml_diff>
--- a/docs/Inleverdocument_Trendbrein_Hugo_Halfmouw.docx
+++ b/docs/Inleverdocument_Trendbrein_Hugo_Halfmouw.docx
@@ -187,6 +187,46 @@
           <w:sz w:val="21"/>
         </w:rPr>
         <w:t>Je vindt er mijn signalen en observaties, clustering en trendduiding, analyse met de modellen uit de lessen, waardeverschuivingen, scenario's, mijn reflectie en rode draad, en de ideation met uiteindelijke kansrichtingen.</w:t>
+      </w:r>
+    </w:p>
+    <w:p>
+      <w:pPr>
+        <w:pPr>
+          <w:spacing w:before="200" w:after="60"/>
+        </w:pPr>
+      </w:pPr>
+      <w:r>
+        <w:rPr>
+          <w:b/>
+          <w:sz w:val="23"/>
+        </w:rPr>
+        <w:t>Technisch in het kort</w:t>
+      </w:r>
+    </w:p>
+    <w:p>
+      <w:pPr>
+        <w:pPr>
+          <w:spacing w:after="200" w:line="293" w:lineRule="auto"/>
+        </w:pPr>
+      </w:pPr>
+      <w:r>
+        <w:rPr>
+          <w:sz w:val="21"/>
+        </w:rPr>
+        <w:t>De website werkt met twee databestanden. In graph.json staan alle onderdelen van mijn Trendbrein en de verbindingen ertussen. In tours.json staat welke stappen de begeleide routes volgen. Daardoor kan ik later een nieuwe versie van de inhoud plaatsen zonder de hele website opnieuw te maken.</w:t>
+      </w:r>
+    </w:p>
+    <w:p>
+      <w:pPr>
+        <w:pPr>
+          <w:spacing w:after="200" w:line="293" w:lineRule="auto"/>
+        </w:pPr>
+      </w:pPr>
+      <w:r>
+        <w:rPr>
+          <w:sz w:val="21"/>
+        </w:rPr>
+        <w:t>De website zet deze gegevens om in een klikbare kaart. Met zoeken, filters en de tours kan een bezoeker gericht door mijn onderzoek gaan. Tijdens een tour toont de kaart alleen de node die op dat moment relevant is en de directe verbanden daaromheen. De voortgang van een tour wordt alleen in de browser bewaard en kan met de resetknop weer worden gewist.</w:t>
       </w:r>
     </w:p>
     <w:p>

</xml_diff>

<commit_message>
Improve reading flow and add tour conclusion
</commit_message>
<xml_diff>
--- a/docs/Inleverdocument_Trendbrein_Hugo_Halfmouw.docx
+++ b/docs/Inleverdocument_Trendbrein_Hugo_Halfmouw.docx
@@ -157,6 +157,15 @@
           <w:sz w:val="21"/>
         </w:rPr>
         <w:t>Je kunt de website vrij verkennen, maar voor de beoordeling raad ik aan om eerst op 'Volg mijn reis' te klikken. Die route vertelt mijn onderzoek in de volgorde waarin het is ontstaan. Je kunt onderweg doorklikken naar signalen, bronnen en andere nodes; de tour onthoudt je voortgang.</w:t>
+      </w:r>
+    </w:p>
+    <w:p>
+      <w:pPr/>
+      <w:r>
+        <w:rPr>
+          <w:sz w:val="21"/>
+        </w:rPr>
+        <w:t>Voor de prettigste ervaring raad ik aan de website op een laptop of groter scherm te bekijken. De route en verdieping werken ook op mobiel, maar op een groter scherm zijn de kaart en aanvullende informatie overzichtelijker.</w:t>
       </w:r>
     </w:p>
     <w:p>

</xml_diff>

<commit_message>
Keep documentation versioned and polish submission document
</commit_message>
<xml_diff>
--- a/docs/Inleverdocument_Trendbrein_Hugo_Halfmouw.docx
+++ b/docs/Inleverdocument_Trendbrein_Hugo_Halfmouw.docx
@@ -5,257 +5,234 @@
     <w:p>
       <w:pPr>
         <w:pStyle w:val="Title"/>
-        <w:spacing w:after="20"/>
         <w:jc w:val="left"/>
       </w:pPr>
       <w:r>
         <w:rPr>
-          <w:rFonts w:ascii="Liberation Sans" w:hAnsi="Liberation Sans"/>
-          <w:b/>
-          <w:i w:val="0"/>
+          <w:rFonts w:ascii="Arial" w:hAnsi="Arial" w:eastAsia="Arial"/>
           <w:color w:val="000000"/>
-          <w:sz w:val="42"/>
         </w:rPr>
         <w:t>Trendbrein</w:t>
       </w:r>
     </w:p>
     <w:p>
       <w:pPr>
-        <w:spacing w:after="20"/>
+        <w:spacing w:after="300"/>
       </w:pPr>
       <w:r>
         <w:rPr>
-          <w:rFonts w:ascii="Liberation Sans" w:hAnsi="Liberation Sans"/>
-          <w:b w:val="0"/>
-          <w:i w:val="0"/>
-          <w:color w:val="52595E"/>
-          <w:sz w:val="21"/>
+          <w:rFonts w:ascii="Arial" w:hAnsi="Arial" w:eastAsia="Arial"/>
+          <w:b/>
+          <w:color w:val="000000"/>
         </w:rPr>
-        <w:t>Trends - Onderneem! De Ontdekkingsreis</w:t>
+        <w:t>Onderneem! De Ontdekkingsreis - trends</w:t>
       </w:r>
     </w:p>
     <w:p>
       <w:pPr>
-        <w:spacing w:after="280"/>
+        <w:spacing w:after="40"/>
       </w:pPr>
       <w:r>
         <w:rPr>
-          <w:rFonts w:ascii="Liberation Sans" w:hAnsi="Liberation Sans"/>
-          <w:b w:val="0"/>
-          <w:i w:val="0"/>
-          <w:color w:val="52595E"/>
-          <w:sz w:val="21"/>
+          <w:rFonts w:ascii="Arial" w:hAnsi="Arial" w:eastAsia="Arial"/>
+          <w:b/>
+          <w:color w:val="000000"/>
+        </w:rPr>
+        <w:t xml:space="preserve">Naam: </w:t>
+      </w:r>
+      <w:r>
+        <w:rPr>
+          <w:rFonts w:ascii="Arial" w:hAnsi="Arial" w:eastAsia="Arial"/>
+          <w:color w:val="000000"/>
         </w:rPr>
         <w:t>Hugo Halfmouw</w:t>
       </w:r>
     </w:p>
     <w:p>
       <w:pPr>
-        <w:spacing w:after="140" w:line="293" w:lineRule="auto"/>
+        <w:spacing w:after="40"/>
       </w:pPr>
       <w:r>
         <w:rPr>
-          <w:rFonts w:ascii="Liberation Sans" w:hAnsi="Liberation Sans"/>
-          <w:b w:val="0"/>
-          <w:i w:val="0"/>
-          <w:color w:val="1C2023"/>
-          <w:sz w:val="21"/>
+          <w:rFonts w:ascii="Arial" w:hAnsi="Arial" w:eastAsia="Arial"/>
+          <w:b/>
+          <w:color w:val="000000"/>
         </w:rPr>
-        <w:t>Tijdens de trendweken heb ik signalen verzameld uit nieuws, producten, sociale media en mijn eigen omgeving. In plaats van een traditioneel verslag heb ik mijn analyse uitgewerkt in een interactief Trendbrein. Daarin laat ik zien hoe ik van losse signalen naar patronen, trends, waardeverschuivingen en mogelijke kansrichtingen ben gegaan.</w:t>
+        <w:t xml:space="preserve">Studentnummer: </w:t>
+      </w:r>
+      <w:r>
+        <w:rPr>
+          <w:rFonts w:ascii="Arial" w:hAnsi="Arial" w:eastAsia="Arial"/>
+          <w:color w:val="000000"/>
+        </w:rPr>
+        <w:t>2107516</w:t>
       </w:r>
     </w:p>
     <w:p>
       <w:pPr>
-        <w:spacing w:before="200" w:after="60"/>
+        <w:spacing w:after="40"/>
       </w:pPr>
       <w:r>
         <w:rPr>
-          <w:rFonts w:ascii="Liberation Sans" w:hAnsi="Liberation Sans"/>
+          <w:rFonts w:ascii="Arial" w:hAnsi="Arial" w:eastAsia="Arial"/>
           <w:b/>
-          <w:i w:val="0"/>
           <w:color w:val="000000"/>
-          <w:sz w:val="23"/>
+        </w:rPr>
+        <w:t xml:space="preserve">HAN e-mailadres: </w:t>
+      </w:r>
+      <w:r>
+        <w:rPr>
+          <w:rFonts w:ascii="Arial" w:hAnsi="Arial" w:eastAsia="Arial"/>
+          <w:color w:val="000000"/>
+        </w:rPr>
+        <w:t>H.halfmao@student.han.nl</w:t>
+      </w:r>
+    </w:p>
+    <w:p>
+      <w:pPr>
+        <w:spacing w:after="40"/>
+      </w:pPr>
+      <w:r>
+        <w:rPr>
+          <w:rFonts w:ascii="Arial" w:hAnsi="Arial" w:eastAsia="Arial"/>
+          <w:b/>
+          <w:color w:val="000000"/>
+        </w:rPr>
+        <w:t xml:space="preserve">Versie: </w:t>
+      </w:r>
+      <w:r>
+        <w:rPr>
+          <w:rFonts w:ascii="Arial" w:hAnsi="Arial" w:eastAsia="Arial"/>
+          <w:color w:val="000000"/>
+        </w:rPr>
+        <w:t>0.8.1</w:t>
+      </w:r>
+    </w:p>
+    <w:p>
+      <w:pPr>
+        <w:pStyle w:val="Heading1"/>
+      </w:pPr>
+      <w:r>
+        <w:rPr>
+          <w:rFonts w:ascii="Arial" w:hAnsi="Arial" w:eastAsia="Arial"/>
+          <w:color w:val="000000"/>
         </w:rPr>
         <w:t>Website</w:t>
       </w:r>
     </w:p>
     <w:p>
-      <w:pPr>
-        <w:spacing w:after="80"/>
-      </w:pPr>
       <w:r>
         <w:rPr>
-          <w:rFonts w:ascii="Liberation Sans" w:hAnsi="Liberation Sans"/>
-          <w:b/>
-          <w:i w:val="0"/>
-          <w:color w:val="1C2023"/>
-          <w:sz w:val="21"/>
+          <w:rFonts w:ascii="Arial" w:hAnsi="Arial" w:eastAsia="Arial"/>
+          <w:color w:val="000000"/>
         </w:rPr>
-        <w:t xml:space="preserve">Interactieve uitwerking: </w:t>
+        <w:t xml:space="preserve">Trendbrein is te bekijken via: </w:t>
       </w:r>
-      <w:hyperlink r:id="rId9">
-        <w:r>
-          <w:rPr>
-            <w:color w:val="0563C1"/>
-            <w:u w:val="single"/>
-            <w:sz w:val="21"/>
-          </w:rPr>
-          <w:t>https://hugodiepugo.github.io/TrendBrein/</w:t>
-        </w:r>
-      </w:hyperlink>
-    </w:p>
-    <w:p>
-      <w:pPr>
-        <w:spacing w:after="100"/>
-      </w:pPr>
       <w:r>
         <w:rPr>
-          <w:rFonts w:ascii="Liberation Sans" w:hAnsi="Liberation Sans"/>
-          <w:b w:val="0"/>
-          <w:i w:val="0"/>
-          <w:color w:val="52595E"/>
-          <w:sz w:val="19"/>
+          <w:rFonts w:ascii="Arial" w:hAnsi="Arial" w:eastAsia="Arial"/>
+          <w:color w:val="000000"/>
+          <w:u w:val="none"/>
         </w:rPr>
-        <w:t xml:space="preserve">Project en broncode: </w:t>
-      </w:r>
-      <w:hyperlink r:id="rId10">
-        <w:r>
-          <w:rPr>
-            <w:color w:val="0563C1"/>
-            <w:u w:val="single"/>
-            <w:sz w:val="19"/>
-          </w:rPr>
-          <w:t>https://github.com/HugoDiePugo/TrendBrein</w:t>
-        </w:r>
-      </w:hyperlink>
-    </w:p>
-    <w:p>
-      <w:pPr>
-        <w:spacing w:before="200" w:after="60"/>
-      </w:pPr>
-      <w:r>
-        <w:rPr>
-          <w:rFonts w:ascii="Liberation Sans" w:hAnsi="Liberation Sans"/>
-          <w:b/>
-          <w:i w:val="0"/>
-          <w:color w:val="000000"/>
-          <w:sz w:val="23"/>
-        </w:rPr>
-        <w:t>Aanbevolen manier van bekijken</w:t>
+        <w:t>https://hugodiepugo.github.io/TrendBrein/</w:t>
       </w:r>
     </w:p>
     <w:p>
       <w:pPr>
-        <w:spacing w:after="140" w:line="293" w:lineRule="auto"/>
+        <w:pStyle w:val="Heading1"/>
       </w:pPr>
       <w:r>
         <w:rPr>
-          <w:rFonts w:ascii="Liberation Sans" w:hAnsi="Liberation Sans"/>
-          <w:b w:val="0"/>
-          <w:i w:val="0"/>
-          <w:color w:val="1C2023"/>
-          <w:sz w:val="21"/>
+          <w:rFonts w:ascii="Arial" w:hAnsi="Arial" w:eastAsia="Arial"/>
+          <w:color w:val="000000"/>
         </w:rPr>
-        <w:t>Je kunt de website vrij verkennen, maar voor de beoordeling raad ik aan om eerst op 'Volg mijn reis' te klikken. Die route vertelt mijn onderzoek in de volgorde waarin het is ontstaan. Je kunt onderweg doorklikken naar signalen, bronnen en andere nodes; de tour onthoudt je voortgang.</w:t>
+        <w:t>Toelichting</w:t>
       </w:r>
     </w:p>
     <w:p>
-      <w:pPr/>
       <w:r>
         <w:rPr>
-          <w:sz w:val="21"/>
+          <w:rFonts w:ascii="Arial" w:hAnsi="Arial" w:eastAsia="Arial"/>
+          <w:color w:val="000000"/>
+        </w:rPr>
+        <w:t>Trendbrein is een interactieve website waarin ik mijn denkproces bij de trendwatchingopdracht laat zien. Bezoekers kunnen mijn route volgen van signalen naar trends en kansrichtingen, of zelf door de kaart navigeren.</w:t>
+      </w:r>
+    </w:p>
+    <w:p>
+      <w:r>
+        <w:rPr>
+          <w:rFonts w:ascii="Arial" w:hAnsi="Arial" w:eastAsia="Arial"/>
+          <w:color w:val="000000"/>
         </w:rPr>
         <w:t>Voor de prettigste ervaring raad ik aan de website op een laptop of groter scherm te bekijken. De route en verdieping werken ook op mobiel, maar op een groter scherm zijn de kaart en aanvullende informatie overzichtelijker.</w:t>
       </w:r>
     </w:p>
     <w:p>
       <w:pPr>
-        <w:spacing w:before="200" w:after="60"/>
+        <w:pStyle w:val="Heading1"/>
       </w:pPr>
       <w:r>
         <w:rPr>
-          <w:rFonts w:ascii="Liberation Sans" w:hAnsi="Liberation Sans"/>
-          <w:b/>
-          <w:i w:val="0"/>
+          <w:rFonts w:ascii="Arial" w:hAnsi="Arial" w:eastAsia="Arial"/>
           <w:color w:val="000000"/>
-          <w:sz w:val="23"/>
         </w:rPr>
-        <w:t>Wat je in de website vindt</w:t>
+        <w:t>Wat de website bevat</w:t>
+      </w:r>
+    </w:p>
+    <w:p>
+      <w:r>
+        <w:rPr>
+          <w:rFonts w:ascii="Arial" w:hAnsi="Arial" w:eastAsia="Arial"/>
+          <w:color w:val="000000"/>
+        </w:rPr>
+        <w:t>De website bevat mijn verzamelde signalen, de verbanden die ik daartussen heb gelegd, mijn trends, waardeverschuivingen en kansrichtingen. De begeleide routes geven de rode draad; via de kaart zijn nodes afzonderlijk te openen voor verdieping.</w:t>
       </w:r>
     </w:p>
     <w:p>
       <w:pPr>
-        <w:spacing w:after="200" w:line="293" w:lineRule="auto"/>
+        <w:pStyle w:val="Heading1"/>
       </w:pPr>
       <w:r>
         <w:rPr>
-          <w:rFonts w:ascii="Liberation Sans" w:hAnsi="Liberation Sans"/>
-          <w:b w:val="0"/>
-          <w:i w:val="0"/>
-          <w:color w:val="1C2023"/>
-          <w:sz w:val="21"/>
-        </w:rPr>
-        <w:t>Je vindt er mijn signalen en observaties, clustering en trendduiding, analyse met de modellen uit de lessen, waardeverschuivingen, scenario's, mijn reflectie en rode draad, en de ideation met uiteindelijke kansrichtingen.</w:t>
-      </w:r>
-    </w:p>
-    <w:p>
-      <w:pPr>
-        <w:pPr>
-          <w:spacing w:before="200" w:after="60"/>
-        </w:pPr>
-      </w:pPr>
-      <w:r>
-        <w:rPr>
-          <w:b/>
-          <w:sz w:val="23"/>
+          <w:rFonts w:ascii="Arial" w:hAnsi="Arial" w:eastAsia="Arial"/>
+          <w:color w:val="000000"/>
         </w:rPr>
         <w:t>Technisch in het kort</w:t>
       </w:r>
     </w:p>
     <w:p>
-      <w:pPr>
-        <w:pPr>
-          <w:spacing w:after="200" w:line="293" w:lineRule="auto"/>
-        </w:pPr>
-      </w:pPr>
       <w:r>
         <w:rPr>
-          <w:sz w:val="21"/>
+          <w:rFonts w:ascii="Arial" w:hAnsi="Arial" w:eastAsia="Arial"/>
+          <w:color w:val="000000"/>
         </w:rPr>
-        <w:t>De website werkt met twee databestanden. In graph.json staan alle onderdelen van mijn Trendbrein en de verbindingen ertussen. In tours.json staat welke stappen de begeleide routes volgen. Daardoor kan ik later een nieuwe versie van de inhoud plaatsen zonder de hele website opnieuw te maken.</w:t>
+        <w:t>De website is gebouwd als een statische React- en TypeScript-app. De inhoud staat in twee JSON-bestanden: een bestand met de kaart en een bestand met de routes. De kaart is interactief: je kunt inzoomen, nodes openen en relaties bekijken. Tourvoortgang wordt alleen lokaal in de browser bewaard en kan worden gereset.</w:t>
       </w:r>
     </w:p>
     <w:p>
       <w:pPr>
-        <w:pPr>
-          <w:spacing w:after="200" w:line="293" w:lineRule="auto"/>
-        </w:pPr>
+        <w:pStyle w:val="Heading1"/>
       </w:pPr>
       <w:r>
         <w:rPr>
-          <w:sz w:val="21"/>
+          <w:rFonts w:ascii="Arial" w:hAnsi="Arial" w:eastAsia="Arial"/>
+          <w:color w:val="000000"/>
         </w:rPr>
-        <w:t>De website zet deze gegevens om in een klikbare kaart. Met zoeken, filters en de tours kan een bezoeker gericht door mijn onderzoek gaan. Tijdens een tour toont de kaart alleen de node die op dat moment relevant is en de directe verbanden daaromheen. De voortgang van een tour wordt alleen in de browser bewaard en kan met de resetknop weer worden gewist.</w:t>
+        <w:t>AI-gebruik</w:t>
       </w:r>
     </w:p>
     <w:p>
-      <w:pPr>
-        <w:spacing w:before="60" w:line="283" w:lineRule="auto"/>
-      </w:pPr>
       <w:r>
         <w:rPr>
-          <w:rFonts w:ascii="Liberation Sans" w:hAnsi="Liberation Sans"/>
-          <w:b w:val="0"/>
-          <w:i/>
-          <w:color w:val="52595E"/>
-          <w:sz w:val="20"/>
+          <w:rFonts w:ascii="Arial" w:hAnsi="Arial" w:eastAsia="Arial"/>
+          <w:color w:val="000000"/>
         </w:rPr>
-        <w:t>De website is mijn daadwerkelijke uitwerking; dit document is alleen een korte ingang voor de beoordeling.</w:t>
+        <w:t>Voor de technische realisatie, debugging, UX-tekstpolish, testondersteuning en documentopmaak heb ik Codex als programmeerassistent gebruikt. De selectie van signalen en bronnen, trendduiding, kansrichtingen en inhoudelijke eindkeuzes heb ik zelf gemaakt.</w:t>
       </w:r>
     </w:p>
     <w:sectPr>
       <w:pgSz w:w="12240" w:h="15840"/>
-      <w:pgMar w:top="1296" w:right="1368" w:bottom="1224" w:left="1368" w:header="720" w:footer="720" w:gutter="0"/>
+      <w:pgMar w:top="1247" w:right="1361" w:bottom="1247" w:left="1361" w:header="720" w:footer="720" w:gutter="0"/>
       <w:cols w:space="720"/>
       <w:docGrid w:linePitch="360"/>
     </w:sectPr>
@@ -626,8 +603,12 @@
     <w:name w:val="Normal"/>
     <w:qFormat/>
     <w:rsid w:val="00FC693F"/>
+    <w:pPr>
+      <w:spacing w:after="140" w:line="283" w:lineRule="auto"/>
+    </w:pPr>
     <w:rPr>
-      <w:rFonts w:ascii="Liberation Sans" w:hAnsi="Liberation Sans"/>
+      <w:rFonts w:ascii="Arial" w:hAnsi="Arial" w:eastAsia="Arial"/>
+      <w:color w:val="000000"/>
       <w:sz w:val="21"/>
     </w:rPr>
   </w:style>
@@ -686,15 +667,15 @@
     <w:pPr>
       <w:keepNext/>
       <w:keepLines/>
-      <w:spacing w:before="480" w:after="0"/>
+      <w:spacing w:before="300" w:after="100"/>
       <w:outlineLvl w:val="0"/>
     </w:pPr>
     <w:rPr>
-      <w:rFonts w:asciiTheme="majorHAnsi" w:eastAsiaTheme="majorEastAsia" w:hAnsiTheme="majorHAnsi" w:cstheme="majorBidi"/>
+      <w:rFonts w:asciiTheme="majorHAnsi" w:eastAsiaTheme="majorEastAsia" w:hAnsiTheme="majorHAnsi" w:cstheme="majorBidi" w:ascii="Arial" w:hAnsi="Arial" w:eastAsia="Arial"/>
       <w:b/>
       <w:bCs/>
-      <w:color w:val="365F91" w:themeColor="accent1" w:themeShade="BF"/>
-      <w:sz w:val="28"/>
+      <w:color w:val="000000"/>
+      <w:sz w:val="26"/>
       <w:szCs w:val="28"/>
     </w:rPr>
   </w:style>
@@ -972,16 +953,16 @@
     <w:qFormat/>
     <w:rsid w:val="00FC693F"/>
     <w:pPr>
-      <w:spacing w:after="300" w:line="240" w:lineRule="auto"/>
+      <w:spacing w:after="240" w:line="240" w:lineRule="auto" w:before="0"/>
       <w:contextualSpacing/>
     </w:pPr>
     <w:rPr>
-      <w:rFonts w:asciiTheme="majorHAnsi" w:eastAsiaTheme="majorEastAsia" w:hAnsiTheme="majorHAnsi" w:cstheme="majorBidi" w:ascii="Liberation Sans" w:hAnsi="Liberation Sans"/>
+      <w:rFonts w:asciiTheme="majorHAnsi" w:eastAsiaTheme="majorEastAsia" w:hAnsiTheme="majorHAnsi" w:cstheme="majorBidi" w:ascii="Arial" w:hAnsi="Arial" w:eastAsia="Arial"/>
       <w:b/>
       <w:color w:val="000000"/>
       <w:spacing w:val="5"/>
       <w:kern w:val="28"/>
-      <w:sz w:val="42"/>
+      <w:sz w:val="44"/>
       <w:szCs w:val="52"/>
     </w:rPr>
   </w:style>

</xml_diff>